<commit_message>
Se agrega el modulo al que pertenece elconsultor
</commit_message>
<xml_diff>
--- a/back/src/static/contratos/Anexo Técnico.docx
+++ b/back/src/static/contratos/Anexo Técnico.docx
@@ -370,7 +370,7 @@
           <w:b/>
           <w:spacing w:val="-2"/>
         </w:rPr>
-        <w:t>SAP</w:t>
+        <w:t>{{PerfilOModulo}}</w:t>
       </w:r>
       <w:r>
         <w:rPr>
@@ -384,7 +384,7 @@
           <w:b/>
           <w:spacing w:val="-2"/>
         </w:rPr>
-        <w:t>ABAP</w:t>
+        <w:t/>
       </w:r>
       <w:r>
         <w:rPr>

</xml_diff>

<commit_message>
Se repara los anexos y contratos
</commit_message>
<xml_diff>
--- a/back/src/static/contratos/Anexo Técnico.docx
+++ b/back/src/static/contratos/Anexo Técnico.docx
@@ -267,34 +267,34 @@
         <w:t xml:space="preserve"> </w:t>
       </w:r>
       <w:r>
-        <w:t>han</w:t>
+        <w:t>han celebrado un Contrato</w:t>
       </w:r>
       <w:r>
         <w:rPr>
           <w:spacing w:val="-13"/>
         </w:rPr>
-        <w:t xml:space="preserve"> </w:t>
-      </w:r>
-      <w:r>
-        <w:t>celebrad</w:t>
+        <w:t xml:space="preserve"/>
+      </w:r>
+      <w:r>
+        <w:t/>
       </w:r>
       <w:r>
         <w:rPr>
           <w:spacing w:val="-13"/>
         </w:rPr>
-        <w:t xml:space="preserve"> </w:t>
-      </w:r>
-      <w:r>
-        <w:t>un</w:t>
+        <w:t xml:space="preserve"/>
+      </w:r>
+      <w:r>
+        <w:t/>
       </w:r>
       <w:r>
         <w:rPr>
           <w:spacing w:val="-13"/>
         </w:rPr>
-        <w:t xml:space="preserve"> </w:t>
-      </w:r>
-      <w:r>
-        <w:t>Contrato</w:t>
+        <w:t xml:space="preserve"/>
+      </w:r>
+      <w:r>
+        <w:t/>
       </w:r>
       <w:r>
         <w:rPr>
@@ -370,14 +370,14 @@
           <w:b/>
           <w:spacing w:val="-2"/>
         </w:rPr>
-        <w:t>{{PerfilOModulo}}</w:t>
+        <w:t>{{PerfilOModulo}} (en adelante</w:t>
       </w:r>
       <w:r>
         <w:rPr>
           <w:b/>
           <w:spacing w:val="-15"/>
         </w:rPr>
-        <w:t xml:space="preserve"> </w:t>
+        <w:t xml:space="preserve"/>
       </w:r>
       <w:r>
         <w:rPr>
@@ -391,25 +391,25 @@
           <w:b/>
           <w:spacing w:val="-14"/>
         </w:rPr>
-        <w:t xml:space="preserve"> </w:t>
-      </w:r>
-      <w:r>
-        <w:rPr>
-          <w:spacing w:val="-2"/>
-        </w:rPr>
-        <w:t>(en</w:t>
+        <w:t xml:space="preserve"/>
+      </w:r>
+      <w:r>
+        <w:rPr>
+          <w:spacing w:val="-2"/>
+        </w:rPr>
+        <w:t/>
       </w:r>
       <w:r>
         <w:rPr>
           <w:spacing w:val="-15"/>
         </w:rPr>
-        <w:t xml:space="preserve"> </w:t>
-      </w:r>
-      <w:r>
-        <w:rPr>
-          <w:spacing w:val="-2"/>
-        </w:rPr>
-        <w:t>adelante</w:t>
+        <w:t xml:space="preserve"/>
+      </w:r>
+      <w:r>
+        <w:rPr>
+          <w:spacing w:val="-2"/>
+        </w:rPr>
+        <w:t/>
       </w:r>
       <w:r>
         <w:rPr>

</xml_diff>